<commit_message>
muunnos tuloksia, uudelleenkirjoitettu tutkimusmenetelmät ja käytäntö
</commit_message>
<xml_diff>
--- a/template.docx
+++ b/template.docx
@@ -146,9 +146,8 @@
         <w:pStyle w:val="Kannentekstit"/>
         <w:ind w:left="0"/>
         <w:sectPr>
-          <w:headerReference w:type="default" r:id="rId11"/>
           <w:pgSz w:w="11906" w:h="16838"/>
-          <w:pgMar w:top="7938" w:right="567" w:bottom="1134" w:left="1134" w:header="2836" w:footer="567" w:gutter="0"/>
+          <w:pgMar w:top="7938" w:right="567" w:bottom="1134" w:left="1134" w:header="2835" w:footer="567" w:gutter="0"/>
           <w:cols w:space="708"/>
           <w:docGrid w:linePitch="360"/>
         </w:sectPr>
@@ -385,7 +384,7 @@
     <w:p>
       <w:pPr>
         <w:sectPr>
-          <w:headerReference w:type="default" r:id="rId12"/>
+          <w:headerReference w:type="default" r:id="rId11"/>
           <w:pgSz w:w="11906" w:h="16838"/>
           <w:pgMar w:top="1701" w:right="567" w:bottom="1134" w:left="1134" w:header="567" w:footer="567" w:gutter="0"/>
           <w:pgNumType w:start="1"/>
@@ -415,7 +414,21 @@
         <w:rPr>
           <w:lang w:val="en-US"/>
         </w:rPr>
-        <w:t>Degree Programme in Business Information Technology</w:t>
+        <w:t xml:space="preserve">Degree </w:t>
+      </w:r>
+      <w:proofErr w:type="spellStart"/>
+      <w:r>
+        <w:rPr>
+          <w:lang w:val="en-US"/>
+        </w:rPr>
+        <w:t>Programme</w:t>
+      </w:r>
+      <w:proofErr w:type="spellEnd"/>
+      <w:r>
+        <w:rPr>
+          <w:lang w:val="en-US"/>
+        </w:rPr>
+        <w:t xml:space="preserve"> in Business Information Technology</w:t>
       </w:r>
     </w:p>
     <w:p>
@@ -477,7 +490,15 @@
         <w:pStyle w:val="Tiivistelmnteksti"/>
       </w:pPr>
       <w:r>
-        <w:t>The first paragraph summarizes your research problem and provides the reader with background information. Use phrases such as: The purpose of the thesis was… The thesis sought to develop/test/analyse… The research question was… Z and Y are also discussed. The commissioner of the thesis should also be introduced in the first paragraph: The thesis was commissioned by…</w:t>
+        <w:t>The first paragraph summarizes your research problem and provides the reader with background information. Use phrases such as: The purpose of the thesis was… The thesis sought to develop/test/</w:t>
+      </w:r>
+      <w:proofErr w:type="spellStart"/>
+      <w:r>
+        <w:t>analyse</w:t>
+      </w:r>
+      <w:proofErr w:type="spellEnd"/>
+      <w:r>
+        <w:t>… The research question was… Z and Y are also discussed. The commissioner of the thesis should also be introduced in the first paragraph: The thesis was commissioned by…</w:t>
       </w:r>
     </w:p>
     <w:p>
@@ -554,7 +575,7 @@
           <w:lang w:val="en-US"/>
         </w:rPr>
         <w:sectPr>
-          <w:headerReference w:type="default" r:id="rId13"/>
+          <w:headerReference w:type="default" r:id="rId12"/>
           <w:pgSz w:w="11906" w:h="16838"/>
           <w:pgMar w:top="1701" w:right="567" w:bottom="1134" w:left="1134" w:header="567" w:footer="567" w:gutter="0"/>
           <w:pgNumType w:start="1"/>
@@ -2838,7 +2859,7 @@
         </w:tabs>
         <w:ind w:left="0" w:firstLine="0"/>
         <w:sectPr>
-          <w:headerReference w:type="default" r:id="rId14"/>
+          <w:headerReference w:type="default" r:id="rId13"/>
           <w:pgSz w:w="11906" w:h="16838"/>
           <w:pgMar w:top="1701" w:right="567" w:bottom="1134" w:left="1134" w:header="567" w:footer="567" w:gutter="0"/>
           <w:pgNumType w:start="1"/>
@@ -2974,7 +2995,7 @@
       <w:r>
         <w:t xml:space="preserve">verkosta: </w:t>
       </w:r>
-      <w:hyperlink r:id="rId15" w:history="1">
+      <w:hyperlink r:id="rId14" w:history="1">
         <w:r>
           <w:rPr>
             <w:rStyle w:val="Hyperlink"/>
@@ -2991,14 +3012,24 @@
       <w:r>
         <w:t xml:space="preserve">video-ohjeita </w:t>
       </w:r>
-      <w:hyperlink r:id="rId16" w:history="1">
-        <w:r>
-          <w:rPr>
-            <w:rStyle w:val="Hyperlink"/>
-          </w:rPr>
-          <w:t>Kalturasta</w:t>
-        </w:r>
-      </w:hyperlink>
+      <w:r>
+        <w:fldChar w:fldCharType="begin"/>
+      </w:r>
+      <w:r>
+        <w:instrText>HYPERLINK "https://kaltura.hamk.fi"</w:instrText>
+      </w:r>
+      <w:r>
+        <w:fldChar w:fldCharType="separate"/>
+      </w:r>
+      <w:r>
+        <w:rPr>
+          <w:rStyle w:val="Hyperlink"/>
+        </w:rPr>
+        <w:t>Kalturasta</w:t>
+      </w:r>
+      <w:r>
+        <w:fldChar w:fldCharType="end"/>
+      </w:r>
       <w:r>
         <w:t xml:space="preserve"> </w:t>
       </w:r>
@@ -3386,7 +3417,7 @@
       <w:r>
         <w:t>(</w:t>
       </w:r>
-      <w:hyperlink r:id="rId17" w:history="1">
+      <w:hyperlink r:id="rId15" w:history="1">
         <w:r>
           <w:rPr>
             <w:rStyle w:val="Hyperlink"/>
@@ -3597,7 +3628,7 @@
                     <pic:cNvPicPr/>
                   </pic:nvPicPr>
                   <pic:blipFill>
-                    <a:blip r:embed="rId18">
+                    <a:blip r:embed="rId16">
                       <a:extLst>
                         <a:ext uri="{28A0092B-C50C-407E-A947-70E740481C1C}">
                           <a14:useLocalDpi xmlns:a14="http://schemas.microsoft.com/office/drawing/2010/main" val="0"/>
@@ -4432,7 +4463,7 @@
                     <pic:cNvPicPr/>
                   </pic:nvPicPr>
                   <pic:blipFill>
-                    <a:blip r:embed="rId19">
+                    <a:blip r:embed="rId17">
                       <a:extLst>
                         <a:ext uri="{28A0092B-C50C-407E-A947-70E740481C1C}">
                           <a14:useLocalDpi xmlns:a14="http://schemas.microsoft.com/office/drawing/2010/main" val="0"/>
@@ -4509,8 +4540,21 @@
       <w:pPr>
         <w:pStyle w:val="Ohjelmakoodi"/>
       </w:pPr>
-      <w:r>
-        <w:t>#include &lt;stdio.h&gt;</w:t>
+      <w:proofErr w:type="gramStart"/>
+      <w:r>
+        <w:t>#include</w:t>
+      </w:r>
+      <w:proofErr w:type="gramEnd"/>
+      <w:r>
+        <w:t xml:space="preserve"> &lt;</w:t>
+      </w:r>
+      <w:proofErr w:type="spellStart"/>
+      <w:r>
+        <w:t>stdio.h</w:t>
+      </w:r>
+      <w:proofErr w:type="spellEnd"/>
+      <w:r>
+        <w:t>&gt;</w:t>
       </w:r>
     </w:p>
     <w:p>
@@ -4518,7 +4562,15 @@
         <w:pStyle w:val="Ohjelmakoodi"/>
       </w:pPr>
       <w:r>
-        <w:t>int main() {</w:t>
+        <w:t xml:space="preserve">int </w:t>
+      </w:r>
+      <w:proofErr w:type="gramStart"/>
+      <w:r>
+        <w:t>main(</w:t>
+      </w:r>
+      <w:proofErr w:type="gramEnd"/>
+      <w:r>
+        <w:t>) {</w:t>
       </w:r>
     </w:p>
     <w:p>
@@ -4526,7 +4578,20 @@
         <w:pStyle w:val="Ohjelmakoodi"/>
       </w:pPr>
       <w:r>
-        <w:t xml:space="preserve">   // printf() displays the string inside quotation</w:t>
+        <w:t xml:space="preserve">   // </w:t>
+      </w:r>
+      <w:proofErr w:type="spellStart"/>
+      <w:proofErr w:type="gramStart"/>
+      <w:r>
+        <w:t>printf</w:t>
+      </w:r>
+      <w:proofErr w:type="spellEnd"/>
+      <w:r>
+        <w:t>(</w:t>
+      </w:r>
+      <w:proofErr w:type="gramEnd"/>
+      <w:r>
+        <w:t>) displays the string inside quotation</w:t>
       </w:r>
     </w:p>
     <w:p>
@@ -4748,7 +4813,7 @@
                     <pic:cNvPicPr/>
                   </pic:nvPicPr>
                   <pic:blipFill>
-                    <a:blip r:embed="rId20">
+                    <a:blip r:embed="rId18">
                       <a:extLst>
                         <a:ext uri="{28A0092B-C50C-407E-A947-70E740481C1C}">
                           <a14:useLocalDpi xmlns:a14="http://schemas.microsoft.com/office/drawing/2010/main" val="0"/>
@@ -4909,14 +4974,24 @@
       <w:r>
         <w:t xml:space="preserve">arkista, että Zoteron asetuksissa on valittuna APA7-viittaustyyli. Tarkista tarvittaessa oikea viittaustapa HAMKin lähdeviiteoppasta tai verkosta </w:t>
       </w:r>
-      <w:hyperlink r:id="rId21" w:anchor=":~:text=The%20authority%20on%20APA%20Style%20and" w:tgtFrame="_blank" w:tooltip="https://apastyle.apa.org/#:~:text=the%20authority%20on%20apa%20style%20and" w:history="1">
-        <w:r>
-          <w:rPr>
-            <w:rStyle w:val="Hyperlink"/>
-          </w:rPr>
-          <w:t>APA Style</w:t>
-        </w:r>
-      </w:hyperlink>
+      <w:r>
+        <w:fldChar w:fldCharType="begin"/>
+      </w:r>
+      <w:r>
+        <w:instrText>HYPERLINK "https://apastyle.apa.org/" \l ":~:text=The%20authority%20on%20APA%20Style%20and" \t "_blank" \o "https://apastyle.apa.org/#:~:text=the%20authority%20on%20apa%20style%20and"</w:instrText>
+      </w:r>
+      <w:r>
+        <w:fldChar w:fldCharType="separate"/>
+      </w:r>
+      <w:r>
+        <w:rPr>
+          <w:rStyle w:val="Hyperlink"/>
+        </w:rPr>
+        <w:t>APA Style</w:t>
+      </w:r>
+      <w:r>
+        <w:fldChar w:fldCharType="end"/>
+      </w:r>
       <w:r>
         <w:t>. Päivämäärien merkinnöissä noudata opinnäytetyön pääkielen (suomi tai englanti) käytäntöjä.</w:t>
       </w:r>
@@ -4953,13 +5028,21 @@
       <w:r>
         <w:t xml:space="preserve"> </w:t>
       </w:r>
+      <w:proofErr w:type="spellStart"/>
       <w:r>
         <w:rPr>
           <w:lang w:val="en-US"/>
         </w:rPr>
-        <w:t xml:space="preserve">Eduix. </w:t>
-      </w:r>
-      <w:hyperlink r:id="rId22" w:history="1">
+        <w:t>Eduix</w:t>
+      </w:r>
+      <w:proofErr w:type="spellEnd"/>
+      <w:r>
+        <w:rPr>
+          <w:lang w:val="en-US"/>
+        </w:rPr>
+        <w:t xml:space="preserve">. </w:t>
+      </w:r>
+      <w:hyperlink r:id="rId19" w:history="1">
         <w:r>
           <w:rPr>
             <w:rStyle w:val="Hyperlink"/>
@@ -4986,7 +5069,7 @@
       <w:r>
         <w:t xml:space="preserve"> </w:t>
       </w:r>
-      <w:hyperlink r:id="rId23" w:history="1">
+      <w:hyperlink r:id="rId20" w:history="1">
         <w:r>
           <w:rPr>
             <w:rStyle w:val="Hyperlink"/>
@@ -5019,8 +5102,8 @@
           <w:noProof/>
         </w:rPr>
         <w:sectPr>
-          <w:headerReference w:type="default" r:id="rId24"/>
-          <w:footerReference w:type="default" r:id="rId25"/>
+          <w:headerReference w:type="default" r:id="rId21"/>
+          <w:footerReference w:type="default" r:id="rId22"/>
           <w:pgSz w:w="11906" w:h="16838"/>
           <w:pgMar w:top="567" w:right="567" w:bottom="1134" w:left="1134" w:header="567" w:footer="567" w:gutter="0"/>
           <w:pgNumType w:start="1"/>
@@ -5297,7 +5380,7 @@
       <w:r>
         <w:t xml:space="preserve">os opinnäytetyösi tutkimusaineisto sisältää </w:t>
       </w:r>
-      <w:hyperlink r:id="rId26">
+      <w:hyperlink r:id="rId23">
         <w:r>
           <w:rPr>
             <w:rStyle w:val="Hyperlink"/>
@@ -5378,7 +5461,7 @@
       <w:r>
         <w:t xml:space="preserve">Valmiissa opinnäytetyössä ei saa julkaista mitään </w:t>
       </w:r>
-      <w:hyperlink r:id="rId27">
+      <w:hyperlink r:id="rId24">
         <w:r>
           <w:rPr>
             <w:rStyle w:val="Hyperlink"/>
@@ -5389,7 +5472,7 @@
       <w:r>
         <w:t xml:space="preserve">, ellei siitä ole tutkittavan kanssa erikseen sovittu. Esimerkiksi haastatteluaineistoa ei julkaista opinnäytetyön liitteenä. Kerro tässä kohdassa, jos käsittelet työssäsi henkilötietoja tai arkaluonteisia (erityisiä) henkilötietoja tai sisältääkö tutkimusaineisto salassa pidettävää tietoa. Muista, että opinnäytetyössä kerätään ainoastaan välttämättömät henkilötiedot. Linkitä tähän kohtaan </w:t>
       </w:r>
-      <w:hyperlink r:id="rId28">
+      <w:hyperlink r:id="rId25">
         <w:r>
           <w:rPr>
             <w:rStyle w:val="Hyperlink"/>
@@ -5620,7 +5703,7 @@
       <w:r>
         <w:t xml:space="preserve">tunnistettavissa, eli aineiston </w:t>
       </w:r>
-      <w:hyperlink r:id="rId29" w:history="1">
+      <w:hyperlink r:id="rId26" w:history="1">
         <w:r>
           <w:rPr>
             <w:rStyle w:val="Hyperlink"/>
@@ -5667,7 +5750,7 @@
       <w:r>
         <w:t xml:space="preserve">sopimus. Sopimuspohjat löytyvät </w:t>
       </w:r>
-      <w:hyperlink r:id="rId30">
+      <w:hyperlink r:id="rId27">
         <w:r>
           <w:rPr>
             <w:rStyle w:val="Hyperlink"/>
@@ -5714,8 +5797,8 @@
       <w:pPr>
         <w:suppressAutoHyphens w:val="0"/>
         <w:sectPr>
-          <w:headerReference w:type="default" r:id="rId31"/>
-          <w:footerReference w:type="default" r:id="rId32"/>
+          <w:headerReference w:type="default" r:id="rId28"/>
+          <w:footerReference w:type="default" r:id="rId29"/>
           <w:pgSz w:w="11906" w:h="16838"/>
           <w:pgMar w:top="1134" w:right="1134" w:bottom="1134" w:left="1134" w:header="708" w:footer="708" w:gutter="0"/>
           <w:pgNumType w:start="1"/>
@@ -5754,7 +5837,7 @@
       </w:pPr>
     </w:p>
     <w:sectPr>
-      <w:headerReference w:type="default" r:id="rId33"/>
+      <w:headerReference w:type="default" r:id="rId30"/>
       <w:pgSz w:w="11906" w:h="16838"/>
       <w:pgMar w:top="567" w:right="567" w:bottom="1134" w:left="1134" w:header="567" w:footer="567" w:gutter="0"/>
       <w:pgNumType w:start="1"/>
@@ -5856,77 +5939,6 @@
 </file>
 
 <file path=word/header1.xml><?xml version="1.0" encoding="utf-8"?>
-<w:hdr xmlns:wpc="http://schemas.microsoft.com/office/word/2010/wordprocessingCanvas" xmlns:cx="http://schemas.microsoft.com/office/drawing/2014/chartex" xmlns:cx1="http://schemas.microsoft.com/office/drawing/2015/9/8/chartex" xmlns:cx2="http://schemas.microsoft.com/office/drawing/2015/10/21/chartex" xmlns:cx3="http://schemas.microsoft.com/office/drawing/2016/5/9/chartex" xmlns:cx4="http://schemas.microsoft.com/office/drawing/2016/5/10/chartex" xmlns:cx5="http://schemas.microsoft.com/office/drawing/2016/5/11/chartex" xmlns:cx6="http://schemas.microsoft.com/office/drawing/2016/5/12/chartex" xmlns:cx7="http://schemas.microsoft.com/office/drawing/2016/5/13/chartex" xmlns:cx8="http://schemas.microsoft.com/office/drawing/2016/5/14/chartex" xmlns:mc="http://schemas.openxmlformats.org/markup-compatibility/2006" xmlns:aink="http://schemas.microsoft.com/office/drawing/2016/ink" xmlns:am3d="http://schemas.microsoft.com/office/drawing/2017/model3d" xmlns:o="urn:schemas-microsoft-com:office:office" xmlns:oel="http://schemas.microsoft.com/office/2019/extlst" xmlns:r="http://schemas.openxmlformats.org/officeDocument/2006/relationships" xmlns:m="http://schemas.openxmlformats.org/officeDocument/2006/math" xmlns:v="urn:schemas-microsoft-com:vml" xmlns:wp14="http://schemas.microsoft.com/office/word/2010/wordprocessingDrawing" xmlns:wp="http://schemas.openxmlformats.org/drawingml/2006/wordprocessingDrawing" xmlns:w10="urn:schemas-microsoft-com:office:word" xmlns:w="http://schemas.openxmlformats.org/wordprocessingml/2006/main" xmlns:w14="http://schemas.microsoft.com/office/word/2010/wordml" xmlns:w15="http://schemas.microsoft.com/office/word/2012/wordml" xmlns:w16cex="http://schemas.microsoft.com/office/word/2018/wordml/cex" xmlns:w16cid="http://schemas.microsoft.com/office/word/2016/wordml/cid" xmlns:w16="http://schemas.microsoft.com/office/word/2018/wordml" xmlns:w16du="http://schemas.microsoft.com/office/word/2023/wordml/word16du" xmlns:w16sdtdh="http://schemas.microsoft.com/office/word/2020/wordml/sdtdatahash" xmlns:w16sdtfl="http://schemas.microsoft.com/office/word/2024/wordml/sdtformatlock" xmlns:w16se="http://schemas.microsoft.com/office/word/2015/wordml/symex" xmlns:wpg="http://schemas.microsoft.com/office/word/2010/wordprocessingGroup" xmlns:wpi="http://schemas.microsoft.com/office/word/2010/wordprocessingInk" xmlns:wne="http://schemas.microsoft.com/office/word/2006/wordml" xmlns:wps="http://schemas.microsoft.com/office/word/2010/wordprocessingShape" mc:Ignorable="w14 w15 w16se w16cid w16 w16cex w16sdtdh w16sdtfl w16du wp14">
-  <w:p>
-    <w:pPr>
-      <w:pStyle w:val="Kannenyltunniste"/>
-    </w:pPr>
-    <w:r>
-      <w:drawing>
-        <wp:inline distT="0" distB="0" distL="0" distR="0" wp14:anchorId="4E42236B" wp14:editId="5A55AB64">
-          <wp:extent cx="2672861" cy="988695"/>
-          <wp:effectExtent l="0" t="0" r="0" b="0"/>
-          <wp:docPr id="161536817" name="Picture 3" descr="Hämeen ammattikorkeakoulun logo">
-            <a:extLst xmlns:a="http://schemas.openxmlformats.org/drawingml/2006/main">
-              <a:ext uri="{C183D7F6-B498-43B3-948B-1728B52AA6E4}">
-                <adec:decorative xmlns:adec="http://schemas.microsoft.com/office/drawing/2017/decorative" val="0"/>
-              </a:ext>
-            </a:extLst>
-          </wp:docPr>
-          <wp:cNvGraphicFramePr>
-            <a:graphicFrameLocks xmlns:a="http://schemas.openxmlformats.org/drawingml/2006/main" noChangeAspect="1"/>
-          </wp:cNvGraphicFramePr>
-          <a:graphic xmlns:a="http://schemas.openxmlformats.org/drawingml/2006/main">
-            <a:graphicData uri="http://schemas.openxmlformats.org/drawingml/2006/picture">
-              <pic:pic xmlns:pic="http://schemas.openxmlformats.org/drawingml/2006/picture">
-                <pic:nvPicPr>
-                  <pic:cNvPr id="3" name="Picture 3" descr="Hämeen ammattikorkeakoulun logo">
-                    <a:extLst>
-                      <a:ext uri="{C183D7F6-B498-43B3-948B-1728B52AA6E4}">
-                        <adec:decorative xmlns:adec="http://schemas.microsoft.com/office/drawing/2017/decorative" val="0"/>
-                      </a:ext>
-                    </a:extLst>
-                  </pic:cNvPr>
-                  <pic:cNvPicPr>
-                    <a:picLocks noChangeAspect="1" noChangeArrowheads="1"/>
-                  </pic:cNvPicPr>
-                </pic:nvPicPr>
-                <pic:blipFill rotWithShape="1">
-                  <a:blip r:embed="rId1" cstate="print">
-                    <a:extLst>
-                      <a:ext uri="{28A0092B-C50C-407E-A947-70E740481C1C}">
-                        <a14:useLocalDpi xmlns:a14="http://schemas.microsoft.com/office/drawing/2010/main" val="0"/>
-                      </a:ext>
-                    </a:extLst>
-                  </a:blip>
-                  <a:srcRect l="-455" t="2443" r="-51"/>
-                  <a:stretch/>
-                </pic:blipFill>
-                <pic:spPr bwMode="auto">
-                  <a:xfrm>
-                    <a:off x="0" y="0"/>
-                    <a:ext cx="2677473" cy="990401"/>
-                  </a:xfrm>
-                  <a:prstGeom prst="rect">
-                    <a:avLst/>
-                  </a:prstGeom>
-                  <a:extLst>
-                    <a:ext uri="{53640926-AAD7-44D8-BBD7-CCE9431645EC}">
-                      <a14:shadowObscured xmlns:a14="http://schemas.microsoft.com/office/drawing/2010/main"/>
-                    </a:ext>
-                  </a:extLst>
-                </pic:spPr>
-              </pic:pic>
-            </a:graphicData>
-          </a:graphic>
-        </wp:inline>
-      </w:drawing>
-    </w:r>
-  </w:p>
-</w:hdr>
-</file>
-
-<file path=word/header2.xml><?xml version="1.0" encoding="utf-8"?>
 <w:hdr xmlns:wpc="http://schemas.microsoft.com/office/word/2010/wordprocessingCanvas" xmlns:cx="http://schemas.microsoft.com/office/drawing/2014/chartex" xmlns:cx1="http://schemas.microsoft.com/office/drawing/2015/9/8/chartex" xmlns:cx2="http://schemas.microsoft.com/office/drawing/2015/10/21/chartex" xmlns:cx3="http://schemas.microsoft.com/office/drawing/2016/5/9/chartex" xmlns:cx4="http://schemas.microsoft.com/office/drawing/2016/5/10/chartex" xmlns:cx5="http://schemas.microsoft.com/office/drawing/2016/5/11/chartex" xmlns:cx6="http://schemas.microsoft.com/office/drawing/2016/5/12/chartex" xmlns:cx7="http://schemas.microsoft.com/office/drawing/2016/5/13/chartex" xmlns:cx8="http://schemas.microsoft.com/office/drawing/2016/5/14/chartex" xmlns:mc="http://schemas.openxmlformats.org/markup-compatibility/2006" xmlns:aink="http://schemas.microsoft.com/office/drawing/2016/ink" xmlns:am3d="http://schemas.microsoft.com/office/drawing/2017/model3d" xmlns:o="urn:schemas-microsoft-com:office:office" xmlns:oel="http://schemas.microsoft.com/office/2019/extlst" xmlns:r="http://schemas.openxmlformats.org/officeDocument/2006/relationships" xmlns:m="http://schemas.openxmlformats.org/officeDocument/2006/math" xmlns:v="urn:schemas-microsoft-com:vml" xmlns:wp14="http://schemas.microsoft.com/office/word/2010/wordprocessingDrawing" xmlns:wp="http://schemas.openxmlformats.org/drawingml/2006/wordprocessingDrawing" xmlns:w10="urn:schemas-microsoft-com:office:word" xmlns:w="http://schemas.openxmlformats.org/wordprocessingml/2006/main" xmlns:w14="http://schemas.microsoft.com/office/word/2010/wordml" xmlns:w15="http://schemas.microsoft.com/office/word/2012/wordml" xmlns:w16cex="http://schemas.microsoft.com/office/word/2018/wordml/cex" xmlns:w16cid="http://schemas.microsoft.com/office/word/2016/wordml/cid" xmlns:w16="http://schemas.microsoft.com/office/word/2018/wordml" xmlns:w16du="http://schemas.microsoft.com/office/word/2023/wordml/word16du" xmlns:w16sdtdh="http://schemas.microsoft.com/office/word/2020/wordml/sdtdatahash" xmlns:w16sdtfl="http://schemas.microsoft.com/office/word/2024/wordml/sdtformatlock" xmlns:w16se="http://schemas.microsoft.com/office/word/2015/wordml/symex" xmlns:wpg="http://schemas.microsoft.com/office/word/2010/wordprocessingGroup" xmlns:wpi="http://schemas.microsoft.com/office/word/2010/wordprocessingInk" xmlns:wne="http://schemas.microsoft.com/office/word/2006/wordml" xmlns:wps="http://schemas.microsoft.com/office/word/2010/wordprocessingShape" mc:Ignorable="w14 w15 w16se w16cid w16 w16cex w16sdtdh w16sdtfl w16du wp14">
   <w:p>
     <w:pPr>
@@ -6015,7 +6027,7 @@
 </w:hdr>
 </file>
 
-<file path=word/header3.xml><?xml version="1.0" encoding="utf-8"?>
+<file path=word/header2.xml><?xml version="1.0" encoding="utf-8"?>
 <w:hdr xmlns:wpc="http://schemas.microsoft.com/office/word/2010/wordprocessingCanvas" xmlns:cx="http://schemas.microsoft.com/office/drawing/2014/chartex" xmlns:cx1="http://schemas.microsoft.com/office/drawing/2015/9/8/chartex" xmlns:cx2="http://schemas.microsoft.com/office/drawing/2015/10/21/chartex" xmlns:cx3="http://schemas.microsoft.com/office/drawing/2016/5/9/chartex" xmlns:cx4="http://schemas.microsoft.com/office/drawing/2016/5/10/chartex" xmlns:cx5="http://schemas.microsoft.com/office/drawing/2016/5/11/chartex" xmlns:cx6="http://schemas.microsoft.com/office/drawing/2016/5/12/chartex" xmlns:cx7="http://schemas.microsoft.com/office/drawing/2016/5/13/chartex" xmlns:cx8="http://schemas.microsoft.com/office/drawing/2016/5/14/chartex" xmlns:mc="http://schemas.openxmlformats.org/markup-compatibility/2006" xmlns:aink="http://schemas.microsoft.com/office/drawing/2016/ink" xmlns:am3d="http://schemas.microsoft.com/office/drawing/2017/model3d" xmlns:o="urn:schemas-microsoft-com:office:office" xmlns:oel="http://schemas.microsoft.com/office/2019/extlst" xmlns:r="http://schemas.openxmlformats.org/officeDocument/2006/relationships" xmlns:m="http://schemas.openxmlformats.org/officeDocument/2006/math" xmlns:v="urn:schemas-microsoft-com:vml" xmlns:wp14="http://schemas.microsoft.com/office/word/2010/wordprocessingDrawing" xmlns:wp="http://schemas.openxmlformats.org/drawingml/2006/wordprocessingDrawing" xmlns:w10="urn:schemas-microsoft-com:office:word" xmlns:w="http://schemas.openxmlformats.org/wordprocessingml/2006/main" xmlns:w14="http://schemas.microsoft.com/office/word/2010/wordml" xmlns:w15="http://schemas.microsoft.com/office/word/2012/wordml" xmlns:w16cex="http://schemas.microsoft.com/office/word/2018/wordml/cex" xmlns:w16cid="http://schemas.microsoft.com/office/word/2016/wordml/cid" xmlns:w16="http://schemas.microsoft.com/office/word/2018/wordml" xmlns:w16du="http://schemas.microsoft.com/office/word/2023/wordml/word16du" xmlns:w16sdtdh="http://schemas.microsoft.com/office/word/2020/wordml/sdtdatahash" xmlns:w16sdtfl="http://schemas.microsoft.com/office/word/2024/wordml/sdtformatlock" xmlns:w16se="http://schemas.microsoft.com/office/word/2015/wordml/symex" xmlns:wpg="http://schemas.microsoft.com/office/word/2010/wordprocessingGroup" xmlns:wpi="http://schemas.microsoft.com/office/word/2010/wordprocessingInk" xmlns:wne="http://schemas.microsoft.com/office/word/2006/wordml" xmlns:wps="http://schemas.microsoft.com/office/word/2010/wordprocessingShape" mc:Ignorable="w14 w15 w16se w16cid w16 w16cex w16sdtdh w16sdtfl w16du wp14">
   <w:p>
     <w:pPr>
@@ -6098,13 +6110,15 @@
     </w:r>
     <w:r>
       <w:tab/>
+    </w:r>
+    <w:r>
       <w:t>Abstract</w:t>
     </w:r>
   </w:p>
 </w:hdr>
 </file>
 
-<file path=word/header4.xml><?xml version="1.0" encoding="utf-8"?>
+<file path=word/header3.xml><?xml version="1.0" encoding="utf-8"?>
 <w:hdr xmlns:wpc="http://schemas.microsoft.com/office/word/2010/wordprocessingCanvas" xmlns:cx="http://schemas.microsoft.com/office/drawing/2014/chartex" xmlns:cx1="http://schemas.microsoft.com/office/drawing/2015/9/8/chartex" xmlns:cx2="http://schemas.microsoft.com/office/drawing/2015/10/21/chartex" xmlns:cx3="http://schemas.microsoft.com/office/drawing/2016/5/9/chartex" xmlns:cx4="http://schemas.microsoft.com/office/drawing/2016/5/10/chartex" xmlns:cx5="http://schemas.microsoft.com/office/drawing/2016/5/11/chartex" xmlns:cx6="http://schemas.microsoft.com/office/drawing/2016/5/12/chartex" xmlns:cx7="http://schemas.microsoft.com/office/drawing/2016/5/13/chartex" xmlns:cx8="http://schemas.microsoft.com/office/drawing/2016/5/14/chartex" xmlns:mc="http://schemas.openxmlformats.org/markup-compatibility/2006" xmlns:aink="http://schemas.microsoft.com/office/drawing/2016/ink" xmlns:am3d="http://schemas.microsoft.com/office/drawing/2017/model3d" xmlns:o="urn:schemas-microsoft-com:office:office" xmlns:oel="http://schemas.microsoft.com/office/2019/extlst" xmlns:r="http://schemas.openxmlformats.org/officeDocument/2006/relationships" xmlns:m="http://schemas.openxmlformats.org/officeDocument/2006/math" xmlns:v="urn:schemas-microsoft-com:vml" xmlns:wp14="http://schemas.microsoft.com/office/word/2010/wordprocessingDrawing" xmlns:wp="http://schemas.openxmlformats.org/drawingml/2006/wordprocessingDrawing" xmlns:w10="urn:schemas-microsoft-com:office:word" xmlns:w="http://schemas.openxmlformats.org/wordprocessingml/2006/main" xmlns:w14="http://schemas.microsoft.com/office/word/2010/wordml" xmlns:w15="http://schemas.microsoft.com/office/word/2012/wordml" xmlns:w16cex="http://schemas.microsoft.com/office/word/2018/wordml/cex" xmlns:w16cid="http://schemas.microsoft.com/office/word/2016/wordml/cid" xmlns:w16="http://schemas.microsoft.com/office/word/2018/wordml" xmlns:w16du="http://schemas.microsoft.com/office/word/2023/wordml/word16du" xmlns:w16sdtdh="http://schemas.microsoft.com/office/word/2020/wordml/sdtdatahash" xmlns:w16sdtfl="http://schemas.microsoft.com/office/word/2024/wordml/sdtformatlock" xmlns:w16se="http://schemas.microsoft.com/office/word/2015/wordml/symex" xmlns:wpg="http://schemas.microsoft.com/office/word/2010/wordprocessingGroup" xmlns:wpi="http://schemas.microsoft.com/office/word/2010/wordprocessingInk" xmlns:wne="http://schemas.microsoft.com/office/word/2006/wordml" xmlns:wps="http://schemas.microsoft.com/office/word/2010/wordprocessingShape" mc:Ignorable="w14 w15 w16se w16cid w16 w16cex w16sdtdh w16sdtfl w16du wp14">
   <w:p>
     <w:pPr>
@@ -6117,7 +6131,7 @@
 </w:hdr>
 </file>
 
-<file path=word/header5.xml><?xml version="1.0" encoding="utf-8"?>
+<file path=word/header4.xml><?xml version="1.0" encoding="utf-8"?>
 <w:hdr xmlns:wpc="http://schemas.microsoft.com/office/word/2010/wordprocessingCanvas" xmlns:cx="http://schemas.microsoft.com/office/drawing/2014/chartex" xmlns:cx1="http://schemas.microsoft.com/office/drawing/2015/9/8/chartex" xmlns:cx2="http://schemas.microsoft.com/office/drawing/2015/10/21/chartex" xmlns:cx3="http://schemas.microsoft.com/office/drawing/2016/5/9/chartex" xmlns:cx4="http://schemas.microsoft.com/office/drawing/2016/5/10/chartex" xmlns:cx5="http://schemas.microsoft.com/office/drawing/2016/5/11/chartex" xmlns:cx6="http://schemas.microsoft.com/office/drawing/2016/5/12/chartex" xmlns:cx7="http://schemas.microsoft.com/office/drawing/2016/5/13/chartex" xmlns:cx8="http://schemas.microsoft.com/office/drawing/2016/5/14/chartex" xmlns:mc="http://schemas.openxmlformats.org/markup-compatibility/2006" xmlns:aink="http://schemas.microsoft.com/office/drawing/2016/ink" xmlns:am3d="http://schemas.microsoft.com/office/drawing/2017/model3d" xmlns:o="urn:schemas-microsoft-com:office:office" xmlns:oel="http://schemas.microsoft.com/office/2019/extlst" xmlns:r="http://schemas.openxmlformats.org/officeDocument/2006/relationships" xmlns:m="http://schemas.openxmlformats.org/officeDocument/2006/math" xmlns:v="urn:schemas-microsoft-com:vml" xmlns:wp14="http://schemas.microsoft.com/office/word/2010/wordprocessingDrawing" xmlns:wp="http://schemas.openxmlformats.org/drawingml/2006/wordprocessingDrawing" xmlns:w10="urn:schemas-microsoft-com:office:word" xmlns:w="http://schemas.openxmlformats.org/wordprocessingml/2006/main" xmlns:w14="http://schemas.microsoft.com/office/word/2010/wordml" xmlns:w15="http://schemas.microsoft.com/office/word/2012/wordml" xmlns:w16cex="http://schemas.microsoft.com/office/word/2018/wordml/cex" xmlns:w16cid="http://schemas.microsoft.com/office/word/2016/wordml/cid" xmlns:w16="http://schemas.microsoft.com/office/word/2018/wordml" xmlns:w16du="http://schemas.microsoft.com/office/word/2023/wordml/word16du" xmlns:w16sdtdh="http://schemas.microsoft.com/office/word/2020/wordml/sdtdatahash" xmlns:w16sdtfl="http://schemas.microsoft.com/office/word/2024/wordml/sdtformatlock" xmlns:w16se="http://schemas.microsoft.com/office/word/2015/wordml/symex" xmlns:wpg="http://schemas.microsoft.com/office/word/2010/wordprocessingGroup" xmlns:wpi="http://schemas.microsoft.com/office/word/2010/wordprocessingInk" xmlns:wne="http://schemas.microsoft.com/office/word/2006/wordml" xmlns:wps="http://schemas.microsoft.com/office/word/2010/wordprocessingShape" mc:Ignorable="w14 w15 w16se w16cid w16 w16cex w16sdtdh w16sdtfl w16du wp14">
   <w:p>
     <w:pPr>
@@ -6132,7 +6146,6 @@
           <w:docPartUnique/>
         </w:docPartObj>
       </w:sdtPr>
-      <w:sdtEndPr/>
       <w:sdtContent>
         <w:r>
           <w:fldChar w:fldCharType="begin"/>
@@ -6170,7 +6183,7 @@
 </w:hdr>
 </file>
 
-<file path=word/header6.xml><?xml version="1.0" encoding="utf-8"?>
+<file path=word/header5.xml><?xml version="1.0" encoding="utf-8"?>
 <w:hdr xmlns:wpc="http://schemas.microsoft.com/office/word/2010/wordprocessingCanvas" xmlns:cx="http://schemas.microsoft.com/office/drawing/2014/chartex" xmlns:cx1="http://schemas.microsoft.com/office/drawing/2015/9/8/chartex" xmlns:cx2="http://schemas.microsoft.com/office/drawing/2015/10/21/chartex" xmlns:cx3="http://schemas.microsoft.com/office/drawing/2016/5/9/chartex" xmlns:cx4="http://schemas.microsoft.com/office/drawing/2016/5/10/chartex" xmlns:cx5="http://schemas.microsoft.com/office/drawing/2016/5/11/chartex" xmlns:cx6="http://schemas.microsoft.com/office/drawing/2016/5/12/chartex" xmlns:cx7="http://schemas.microsoft.com/office/drawing/2016/5/13/chartex" xmlns:cx8="http://schemas.microsoft.com/office/drawing/2016/5/14/chartex" xmlns:mc="http://schemas.openxmlformats.org/markup-compatibility/2006" xmlns:aink="http://schemas.microsoft.com/office/drawing/2016/ink" xmlns:am3d="http://schemas.microsoft.com/office/drawing/2017/model3d" xmlns:o="urn:schemas-microsoft-com:office:office" xmlns:oel="http://schemas.microsoft.com/office/2019/extlst" xmlns:r="http://schemas.openxmlformats.org/officeDocument/2006/relationships" xmlns:m="http://schemas.openxmlformats.org/officeDocument/2006/math" xmlns:v="urn:schemas-microsoft-com:vml" xmlns:wp14="http://schemas.microsoft.com/office/word/2010/wordprocessingDrawing" xmlns:wp="http://schemas.openxmlformats.org/drawingml/2006/wordprocessingDrawing" xmlns:w10="urn:schemas-microsoft-com:office:word" xmlns:w="http://schemas.openxmlformats.org/wordprocessingml/2006/main" xmlns:w14="http://schemas.microsoft.com/office/word/2010/wordml" xmlns:w15="http://schemas.microsoft.com/office/word/2012/wordml" xmlns:w16cex="http://schemas.microsoft.com/office/word/2018/wordml/cex" xmlns:w16cid="http://schemas.microsoft.com/office/word/2016/wordml/cid" xmlns:w16="http://schemas.microsoft.com/office/word/2018/wordml" xmlns:w16du="http://schemas.microsoft.com/office/word/2023/wordml/word16du" xmlns:w16sdtdh="http://schemas.microsoft.com/office/word/2020/wordml/sdtdatahash" xmlns:w16sdtfl="http://schemas.microsoft.com/office/word/2024/wordml/sdtformatlock" xmlns:w16se="http://schemas.microsoft.com/office/word/2015/wordml/symex" xmlns:wpg="http://schemas.microsoft.com/office/word/2010/wordprocessingGroup" xmlns:wpi="http://schemas.microsoft.com/office/word/2010/wordprocessingInk" xmlns:wne="http://schemas.microsoft.com/office/word/2006/wordml" xmlns:wps="http://schemas.microsoft.com/office/word/2010/wordprocessingShape" mc:Ignorable="w14 w15 w16se w16cid w16 w16cex w16sdtdh w16sdtfl w16du wp14">
   <w:sdt>
     <w:sdtPr>
@@ -6180,7 +6193,6 @@
         <w:docPartUnique/>
       </w:docPartObj>
     </w:sdtPr>
-    <w:sdtEndPr/>
     <w:sdtContent>
       <w:p>
         <w:pPr>
@@ -6216,7 +6228,7 @@
 </w:hdr>
 </file>
 
-<file path=word/header7.xml><?xml version="1.0" encoding="utf-8"?>
+<file path=word/header6.xml><?xml version="1.0" encoding="utf-8"?>
 <w:hdr xmlns:wpc="http://schemas.microsoft.com/office/word/2010/wordprocessingCanvas" xmlns:cx="http://schemas.microsoft.com/office/drawing/2014/chartex" xmlns:cx1="http://schemas.microsoft.com/office/drawing/2015/9/8/chartex" xmlns:cx2="http://schemas.microsoft.com/office/drawing/2015/10/21/chartex" xmlns:cx3="http://schemas.microsoft.com/office/drawing/2016/5/9/chartex" xmlns:cx4="http://schemas.microsoft.com/office/drawing/2016/5/10/chartex" xmlns:cx5="http://schemas.microsoft.com/office/drawing/2016/5/11/chartex" xmlns:cx6="http://schemas.microsoft.com/office/drawing/2016/5/12/chartex" xmlns:cx7="http://schemas.microsoft.com/office/drawing/2016/5/13/chartex" xmlns:cx8="http://schemas.microsoft.com/office/drawing/2016/5/14/chartex" xmlns:mc="http://schemas.openxmlformats.org/markup-compatibility/2006" xmlns:aink="http://schemas.microsoft.com/office/drawing/2016/ink" xmlns:am3d="http://schemas.microsoft.com/office/drawing/2017/model3d" xmlns:o="urn:schemas-microsoft-com:office:office" xmlns:oel="http://schemas.microsoft.com/office/2019/extlst" xmlns:r="http://schemas.openxmlformats.org/officeDocument/2006/relationships" xmlns:m="http://schemas.openxmlformats.org/officeDocument/2006/math" xmlns:v="urn:schemas-microsoft-com:vml" xmlns:wp14="http://schemas.microsoft.com/office/word/2010/wordprocessingDrawing" xmlns:wp="http://schemas.openxmlformats.org/drawingml/2006/wordprocessingDrawing" xmlns:w10="urn:schemas-microsoft-com:office:word" xmlns:w="http://schemas.openxmlformats.org/wordprocessingml/2006/main" xmlns:w14="http://schemas.microsoft.com/office/word/2010/wordml" xmlns:w15="http://schemas.microsoft.com/office/word/2012/wordml" xmlns:w16cex="http://schemas.microsoft.com/office/word/2018/wordml/cex" xmlns:w16cid="http://schemas.microsoft.com/office/word/2016/wordml/cid" xmlns:w16="http://schemas.microsoft.com/office/word/2018/wordml" xmlns:w16du="http://schemas.microsoft.com/office/word/2023/wordml/word16du" xmlns:w16sdtdh="http://schemas.microsoft.com/office/word/2020/wordml/sdtdatahash" xmlns:w16sdtfl="http://schemas.microsoft.com/office/word/2024/wordml/sdtformatlock" xmlns:w16se="http://schemas.microsoft.com/office/word/2015/wordml/symex" xmlns:wpg="http://schemas.microsoft.com/office/word/2010/wordprocessingGroup" xmlns:wpi="http://schemas.microsoft.com/office/word/2010/wordprocessingInk" xmlns:wne="http://schemas.microsoft.com/office/word/2006/wordml" xmlns:wps="http://schemas.microsoft.com/office/word/2010/wordprocessingShape" mc:Ignorable="w14 w15 w16se w16cid w16 w16cex w16sdtdh w16sdtfl w16du wp14">
   <w:sdt>
     <w:sdtPr>
@@ -6226,7 +6238,6 @@
         <w:docPartUnique/>
       </w:docPartObj>
     </w:sdtPr>
-    <w:sdtEndPr/>
     <w:sdtContent>
       <w:p>
         <w:pPr>
@@ -8737,12 +8748,9 @@
 </file>
 
 <file path=customXml/item2.xml><?xml version="1.0" encoding="utf-8"?>
-<?mso-contentType ?>
-<FormTemplates xmlns="http://schemas.microsoft.com/sharepoint/v3/contenttype/forms">
-  <Display>DocumentLibraryForm</Display>
-  <Edit>DocumentLibraryForm</Edit>
-  <New>DocumentLibraryForm</New>
-</FormTemplates>
+<p:properties xmlns:p="http://schemas.microsoft.com/office/2006/metadata/properties" xmlns:xsi="http://www.w3.org/2001/XMLSchema-instance" xmlns:pc="http://schemas.microsoft.com/office/infopath/2007/PartnerControls">
+  <documentManagement/>
+</p:properties>
 </file>
 
 <file path=customXml/item3.xml><?xml version="1.0" encoding="utf-8"?>
@@ -8890,9 +8898,12 @@
 </file>
 
 <file path=customXml/item4.xml><?xml version="1.0" encoding="utf-8"?>
-<p:properties xmlns:p="http://schemas.microsoft.com/office/2006/metadata/properties" xmlns:xsi="http://www.w3.org/2001/XMLSchema-instance" xmlns:pc="http://schemas.microsoft.com/office/infopath/2007/PartnerControls">
-  <documentManagement/>
-</p:properties>
+<?mso-contentType ?>
+<FormTemplates xmlns="http://schemas.microsoft.com/sharepoint/v3/contenttype/forms">
+  <Display>DocumentLibraryForm</Display>
+  <Edit>DocumentLibraryForm</Edit>
+  <New>DocumentLibraryForm</New>
+</FormTemplates>
 </file>
 
 <file path=customXml/itemProps1.xml><?xml version="1.0" encoding="utf-8"?>
@@ -8904,9 +8915,10 @@
 </file>
 
 <file path=customXml/itemProps2.xml><?xml version="1.0" encoding="utf-8"?>
-<ds:datastoreItem xmlns:ds="http://schemas.openxmlformats.org/officeDocument/2006/customXml" ds:itemID="{5ECCC9D4-E686-4B2F-A1CC-AE846B248C46}">
+<ds:datastoreItem xmlns:ds="http://schemas.openxmlformats.org/officeDocument/2006/customXml" ds:itemID="{71B99032-80EA-45DA-B253-971174D150A4}">
   <ds:schemaRefs>
-    <ds:schemaRef ds:uri="http://schemas.microsoft.com/sharepoint/v3/contenttype/forms"/>
+    <ds:schemaRef ds:uri="http://schemas.microsoft.com/office/2006/metadata/properties"/>
+    <ds:schemaRef ds:uri="http://schemas.microsoft.com/office/infopath/2007/PartnerControls"/>
   </ds:schemaRefs>
 </ds:datastoreItem>
 </file>
@@ -8930,10 +8942,15 @@
 </file>
 
 <file path=customXml/itemProps4.xml><?xml version="1.0" encoding="utf-8"?>
-<ds:datastoreItem xmlns:ds="http://schemas.openxmlformats.org/officeDocument/2006/customXml" ds:itemID="{71B99032-80EA-45DA-B253-971174D150A4}">
+<ds:datastoreItem xmlns:ds="http://schemas.openxmlformats.org/officeDocument/2006/customXml" ds:itemID="{5ECCC9D4-E686-4B2F-A1CC-AE846B248C46}">
   <ds:schemaRefs>
-    <ds:schemaRef ds:uri="http://schemas.microsoft.com/office/2006/metadata/properties"/>
-    <ds:schemaRef ds:uri="http://schemas.microsoft.com/office/infopath/2007/PartnerControls"/>
+    <ds:schemaRef ds:uri="http://schemas.microsoft.com/sharepoint/v3/contenttype/forms"/>
   </ds:schemaRefs>
 </ds:datastoreItem>
+</file>
+
+<file path=docMetadata/LabelInfo.xml><?xml version="1.0" encoding="utf-8"?>
+<clbl:labelList xmlns:clbl="http://schemas.microsoft.com/office/2020/mipLabelMetadata">
+  <clbl:label id="{fbd2f045-b34c-4673-9534-8f2374355cec}" enabled="0" method="" siteId="{fbd2f045-b34c-4673-9534-8f2374355cec}" removed="1"/>
+</clbl:labelList>
 </file>
</xml_diff>